<commit_message>
Remove redundant "Nature of engagement" row from internship particulars
The letter's title and Clause 3 already establish this is a training
internship, not employment, making the particulars-table row redundant.
Removed for the internship template only (full-time/part-time keep their
own "nature of engagement" framing where it's more load-bearing).

Co-Authored-By: Claude Sonnet 5 <noreply@anthropic.com>
</commit_message>
<xml_diff>
--- a/offerletter/internship/sloud-internship-letter-template.docx
+++ b/offerletter/internship/sloud-internship-letter-template.docx
@@ -474,57 +474,6 @@
                 <w:szCs w:val="21"/>
               </w:rPr>
               <w:t xml:space="preserve">[Function or team]</w:t>
-            </w:r>
-          </w:p>
-        </w:tc>
-      </w:tr>
-      <w:tr>
-        <w:tc>
-          <w:tcPr>
-            <w:tcW w:type="dxa" w:w="2900"/>
-            <w:shd w:fill="F1F5F9" w:color="auto" w:val="clear"/>
-            <w:tcMar>
-              <w:top w:type="dxa" w:w="70"/>
-              <w:left w:type="dxa" w:w="110"/>
-              <w:bottom w:type="dxa" w:w="70"/>
-              <w:right w:type="dxa" w:w="110"/>
-            </w:tcMar>
-            <w:vAlign w:val="center"/>
-          </w:tcPr>
-          <w:p>
-            <w:r>
-              <w:rPr>
-                <w:rFonts w:ascii="Calibri" w:cs="Calibri" w:eastAsia="Calibri" w:hAnsi="Calibri"/>
-                <w:b/>
-                <w:bCs/>
-                <w:color w:val="102A43"/>
-                <w:sz w:val="21"/>
-                <w:szCs w:val="21"/>
-              </w:rPr>
-              <w:t xml:space="preserve">Nature of engagement</w:t>
-            </w:r>
-          </w:p>
-        </w:tc>
-        <w:tc>
-          <w:tcPr>
-            <w:tcW w:type="dxa" w:w="6846"/>
-            <w:tcMar>
-              <w:top w:type="dxa" w:w="70"/>
-              <w:left w:type="dxa" w:w="110"/>
-              <w:bottom w:type="dxa" w:w="70"/>
-              <w:right w:type="dxa" w:w="110"/>
-            </w:tcMar>
-            <w:vAlign w:val="center"/>
-          </w:tcPr>
-          <w:p>
-            <w:r>
-              <w:rPr>
-                <w:rFonts w:ascii="Calibri" w:cs="Calibri" w:eastAsia="Calibri" w:hAnsi="Calibri"/>
-                <w:color w:val="1F2937"/>
-                <w:sz w:val="21"/>
-                <w:szCs w:val="21"/>
-              </w:rPr>
-              <w:t xml:space="preserve">Internship for training and learning purposes; not employment</w:t>
             </w:r>
           </w:p>
         </w:tc>

</xml_diff>

<commit_message>
Top-align table cell text instead of vertical-center
Every table cell in the internship template used vAlign="center", which
floats short single-line labels (Role title, Role summary, etc.) in the
middle of a row rather than at the top -- reads like a detached text box
instead of normal document flow, especially visible in Annexure A1/A2/A3
where row heights vary a lot between cells.

Co-Authored-By: Claude Sonnet 5 <noreply@anthropic.com>
</commit_message>
<xml_diff>
--- a/offerletter/internship/sloud-internship-letter-template.docx
+++ b/offerletter/internship/sloud-internship-letter-template.docx
@@ -29,7 +29,7 @@
               <w:bottom w:type="dxa" w:w="0"/>
               <w:right w:type="dxa" w:w="0"/>
             </w:tcMar>
-            <w:vAlign w:val="center"/>
+            <w:vAlign w:val="top"/>
             <w:tcBorders>
               <w:top w:val="nil"/>
               <w:left w:val="nil"/>
@@ -92,7 +92,7 @@
               <w:bottom w:type="dxa" w:w="0"/>
               <w:right w:type="dxa" w:w="0"/>
             </w:tcMar>
-            <w:vAlign w:val="center"/>
+            <w:vAlign w:val="top"/>
             <w:tcBorders>
               <w:top w:val="nil"/>
               <w:left w:val="nil"/>
@@ -445,7 +445,7 @@
               <w:bottom w:type="dxa" w:w="70"/>
               <w:right w:type="dxa" w:w="110"/>
             </w:tcMar>
-            <w:vAlign w:val="center"/>
+            <w:vAlign w:val="top"/>
           </w:tcPr>
           <w:p>
             <w:pPr>
@@ -473,7 +473,7 @@
               <w:bottom w:type="dxa" w:w="70"/>
               <w:right w:type="dxa" w:w="110"/>
             </w:tcMar>
-            <w:vAlign w:val="center"/>
+            <w:vAlign w:val="top"/>
           </w:tcPr>
           <w:p>
             <w:pPr>
@@ -505,7 +505,7 @@
               <w:bottom w:type="dxa" w:w="70"/>
               <w:right w:type="dxa" w:w="110"/>
             </w:tcMar>
-            <w:vAlign w:val="center"/>
+            <w:vAlign w:val="top"/>
           </w:tcPr>
           <w:p>
             <w:pPr>
@@ -533,7 +533,7 @@
               <w:bottom w:type="dxa" w:w="70"/>
               <w:right w:type="dxa" w:w="110"/>
             </w:tcMar>
-            <w:vAlign w:val="center"/>
+            <w:vAlign w:val="top"/>
           </w:tcPr>
           <w:p>
             <w:pPr>
@@ -565,7 +565,7 @@
               <w:bottom w:type="dxa" w:w="70"/>
               <w:right w:type="dxa" w:w="110"/>
             </w:tcMar>
-            <w:vAlign w:val="center"/>
+            <w:vAlign w:val="top"/>
           </w:tcPr>
           <w:p>
             <w:pPr>
@@ -593,7 +593,7 @@
               <w:bottom w:type="dxa" w:w="70"/>
               <w:right w:type="dxa" w:w="110"/>
             </w:tcMar>
-            <w:vAlign w:val="center"/>
+            <w:vAlign w:val="top"/>
           </w:tcPr>
           <w:p>
             <w:pPr>
@@ -625,7 +625,7 @@
               <w:bottom w:type="dxa" w:w="70"/>
               <w:right w:type="dxa" w:w="110"/>
             </w:tcMar>
-            <w:vAlign w:val="center"/>
+            <w:vAlign w:val="top"/>
           </w:tcPr>
           <w:p>
             <w:pPr>
@@ -653,7 +653,7 @@
               <w:bottom w:type="dxa" w:w="70"/>
               <w:right w:type="dxa" w:w="110"/>
             </w:tcMar>
-            <w:vAlign w:val="center"/>
+            <w:vAlign w:val="top"/>
           </w:tcPr>
           <w:p>
             <w:pPr>
@@ -685,7 +685,7 @@
               <w:bottom w:type="dxa" w:w="70"/>
               <w:right w:type="dxa" w:w="110"/>
             </w:tcMar>
-            <w:vAlign w:val="center"/>
+            <w:vAlign w:val="top"/>
           </w:tcPr>
           <w:p>
             <w:pPr>
@@ -713,7 +713,7 @@
               <w:bottom w:type="dxa" w:w="70"/>
               <w:right w:type="dxa" w:w="110"/>
             </w:tcMar>
-            <w:vAlign w:val="center"/>
+            <w:vAlign w:val="top"/>
           </w:tcPr>
           <w:p>
             <w:pPr>
@@ -745,7 +745,7 @@
               <w:bottom w:type="dxa" w:w="70"/>
               <w:right w:type="dxa" w:w="110"/>
             </w:tcMar>
-            <w:vAlign w:val="center"/>
+            <w:vAlign w:val="top"/>
           </w:tcPr>
           <w:p>
             <w:pPr>
@@ -773,7 +773,7 @@
               <w:bottom w:type="dxa" w:w="70"/>
               <w:right w:type="dxa" w:w="110"/>
             </w:tcMar>
-            <w:vAlign w:val="center"/>
+            <w:vAlign w:val="top"/>
           </w:tcPr>
           <w:p>
             <w:pPr>
@@ -805,7 +805,7 @@
               <w:bottom w:type="dxa" w:w="70"/>
               <w:right w:type="dxa" w:w="110"/>
             </w:tcMar>
-            <w:vAlign w:val="center"/>
+            <w:vAlign w:val="top"/>
           </w:tcPr>
           <w:p>
             <w:pPr>
@@ -833,7 +833,7 @@
               <w:bottom w:type="dxa" w:w="70"/>
               <w:right w:type="dxa" w:w="110"/>
             </w:tcMar>
-            <w:vAlign w:val="center"/>
+            <w:vAlign w:val="top"/>
           </w:tcPr>
           <w:p>
             <w:pPr>
@@ -865,7 +865,7 @@
               <w:bottom w:type="dxa" w:w="70"/>
               <w:right w:type="dxa" w:w="110"/>
             </w:tcMar>
-            <w:vAlign w:val="center"/>
+            <w:vAlign w:val="top"/>
           </w:tcPr>
           <w:p>
             <w:pPr>
@@ -893,7 +893,7 @@
               <w:bottom w:type="dxa" w:w="70"/>
               <w:right w:type="dxa" w:w="110"/>
             </w:tcMar>
-            <w:vAlign w:val="center"/>
+            <w:vAlign w:val="top"/>
           </w:tcPr>
           <w:p>
             <w:pPr>
@@ -925,7 +925,7 @@
               <w:bottom w:type="dxa" w:w="70"/>
               <w:right w:type="dxa" w:w="110"/>
             </w:tcMar>
-            <w:vAlign w:val="center"/>
+            <w:vAlign w:val="top"/>
           </w:tcPr>
           <w:p>
             <w:pPr>
@@ -953,7 +953,7 @@
               <w:bottom w:type="dxa" w:w="70"/>
               <w:right w:type="dxa" w:w="110"/>
             </w:tcMar>
-            <w:vAlign w:val="center"/>
+            <w:vAlign w:val="top"/>
           </w:tcPr>
           <w:p>
             <w:pPr>
@@ -985,7 +985,7 @@
               <w:bottom w:type="dxa" w:w="70"/>
               <w:right w:type="dxa" w:w="110"/>
             </w:tcMar>
-            <w:vAlign w:val="center"/>
+            <w:vAlign w:val="top"/>
           </w:tcPr>
           <w:p>
             <w:pPr>
@@ -1013,7 +1013,7 @@
               <w:bottom w:type="dxa" w:w="70"/>
               <w:right w:type="dxa" w:w="110"/>
             </w:tcMar>
-            <w:vAlign w:val="center"/>
+            <w:vAlign w:val="top"/>
           </w:tcPr>
           <w:p>
             <w:pPr>
@@ -1045,7 +1045,7 @@
               <w:bottom w:type="dxa" w:w="70"/>
               <w:right w:type="dxa" w:w="110"/>
             </w:tcMar>
-            <w:vAlign w:val="center"/>
+            <w:vAlign w:val="top"/>
           </w:tcPr>
           <w:p>
             <w:pPr>
@@ -1073,7 +1073,7 @@
               <w:bottom w:type="dxa" w:w="70"/>
               <w:right w:type="dxa" w:w="110"/>
             </w:tcMar>
-            <w:vAlign w:val="center"/>
+            <w:vAlign w:val="top"/>
           </w:tcPr>
           <w:p>
             <w:pPr>
@@ -3108,7 +3108,7 @@
               <w:bottom w:type="dxa" w:w="70"/>
               <w:right w:type="dxa" w:w="110"/>
             </w:tcMar>
-            <w:vAlign w:val="center"/>
+            <w:vAlign w:val="top"/>
           </w:tcPr>
           <w:p>
             <w:pPr>
@@ -3136,7 +3136,7 @@
               <w:bottom w:type="dxa" w:w="70"/>
               <w:right w:type="dxa" w:w="110"/>
             </w:tcMar>
-            <w:vAlign w:val="center"/>
+            <w:vAlign w:val="top"/>
           </w:tcPr>
           <w:p>
             <w:pPr>
@@ -3168,7 +3168,7 @@
               <w:bottom w:type="dxa" w:w="70"/>
               <w:right w:type="dxa" w:w="110"/>
             </w:tcMar>
-            <w:vAlign w:val="center"/>
+            <w:vAlign w:val="top"/>
           </w:tcPr>
           <w:p>
             <w:pPr>
@@ -3196,7 +3196,7 @@
               <w:bottom w:type="dxa" w:w="70"/>
               <w:right w:type="dxa" w:w="110"/>
             </w:tcMar>
-            <w:vAlign w:val="center"/>
+            <w:vAlign w:val="top"/>
           </w:tcPr>
           <w:p>
             <w:pPr>
@@ -3228,7 +3228,7 @@
               <w:bottom w:type="dxa" w:w="70"/>
               <w:right w:type="dxa" w:w="110"/>
             </w:tcMar>
-            <w:vAlign w:val="center"/>
+            <w:vAlign w:val="top"/>
           </w:tcPr>
           <w:p>
             <w:pPr>
@@ -3256,7 +3256,7 @@
               <w:bottom w:type="dxa" w:w="70"/>
               <w:right w:type="dxa" w:w="110"/>
             </w:tcMar>
-            <w:vAlign w:val="center"/>
+            <w:vAlign w:val="top"/>
           </w:tcPr>
           <w:p>
             <w:pPr>
@@ -3316,7 +3316,7 @@
               <w:bottom w:type="dxa" w:w="70"/>
               <w:right w:type="dxa" w:w="110"/>
             </w:tcMar>
-            <w:vAlign w:val="center"/>
+            <w:vAlign w:val="top"/>
           </w:tcPr>
           <w:p>
             <w:pPr>
@@ -3344,7 +3344,7 @@
               <w:bottom w:type="dxa" w:w="70"/>
               <w:right w:type="dxa" w:w="110"/>
             </w:tcMar>
-            <w:vAlign w:val="center"/>
+            <w:vAlign w:val="top"/>
           </w:tcPr>
           <w:p>
             <w:pPr>
@@ -3416,7 +3416,7 @@
               <w:bottom w:type="dxa" w:w="70"/>
               <w:right w:type="dxa" w:w="110"/>
             </w:tcMar>
-            <w:vAlign w:val="center"/>
+            <w:vAlign w:val="top"/>
           </w:tcPr>
           <w:p>
             <w:pPr>
@@ -3444,7 +3444,7 @@
               <w:bottom w:type="dxa" w:w="70"/>
               <w:right w:type="dxa" w:w="110"/>
             </w:tcMar>
-            <w:vAlign w:val="center"/>
+            <w:vAlign w:val="top"/>
           </w:tcPr>
           <w:p>
             <w:pPr>
@@ -3476,7 +3476,7 @@
               <w:bottom w:type="dxa" w:w="70"/>
               <w:right w:type="dxa" w:w="110"/>
             </w:tcMar>
-            <w:vAlign w:val="center"/>
+            <w:vAlign w:val="top"/>
           </w:tcPr>
           <w:p>
             <w:pPr>
@@ -3504,7 +3504,7 @@
               <w:bottom w:type="dxa" w:w="70"/>
               <w:right w:type="dxa" w:w="110"/>
             </w:tcMar>
-            <w:vAlign w:val="center"/>
+            <w:vAlign w:val="top"/>
           </w:tcPr>
           <w:p>
             <w:pPr>
@@ -3536,7 +3536,7 @@
               <w:bottom w:type="dxa" w:w="70"/>
               <w:right w:type="dxa" w:w="110"/>
             </w:tcMar>
-            <w:vAlign w:val="center"/>
+            <w:vAlign w:val="top"/>
           </w:tcPr>
           <w:p>
             <w:pPr>
@@ -3564,7 +3564,7 @@
               <w:bottom w:type="dxa" w:w="70"/>
               <w:right w:type="dxa" w:w="110"/>
             </w:tcMar>
-            <w:vAlign w:val="center"/>
+            <w:vAlign w:val="top"/>
           </w:tcPr>
           <w:p>
             <w:pPr>
@@ -3596,7 +3596,7 @@
               <w:bottom w:type="dxa" w:w="70"/>
               <w:right w:type="dxa" w:w="110"/>
             </w:tcMar>
-            <w:vAlign w:val="center"/>
+            <w:vAlign w:val="top"/>
           </w:tcPr>
           <w:p>
             <w:pPr>
@@ -3624,7 +3624,7 @@
               <w:bottom w:type="dxa" w:w="70"/>
               <w:right w:type="dxa" w:w="110"/>
             </w:tcMar>
-            <w:vAlign w:val="center"/>
+            <w:vAlign w:val="top"/>
           </w:tcPr>
           <w:p>
             <w:pPr>
@@ -3656,7 +3656,7 @@
               <w:bottom w:type="dxa" w:w="70"/>
               <w:right w:type="dxa" w:w="110"/>
             </w:tcMar>
-            <w:vAlign w:val="center"/>
+            <w:vAlign w:val="top"/>
           </w:tcPr>
           <w:p>
             <w:pPr>
@@ -3684,7 +3684,7 @@
               <w:bottom w:type="dxa" w:w="70"/>
               <w:right w:type="dxa" w:w="110"/>
             </w:tcMar>
-            <w:vAlign w:val="center"/>
+            <w:vAlign w:val="top"/>
           </w:tcPr>
           <w:p>
             <w:pPr>
@@ -3756,7 +3756,7 @@
               <w:bottom w:type="dxa" w:w="70"/>
               <w:right w:type="dxa" w:w="110"/>
             </w:tcMar>
-            <w:vAlign w:val="center"/>
+            <w:vAlign w:val="top"/>
           </w:tcPr>
           <w:p>
             <w:pPr>
@@ -3784,7 +3784,7 @@
               <w:bottom w:type="dxa" w:w="70"/>
               <w:right w:type="dxa" w:w="110"/>
             </w:tcMar>
-            <w:vAlign w:val="center"/>
+            <w:vAlign w:val="top"/>
           </w:tcPr>
           <w:p>
             <w:pPr>
@@ -3872,7 +3872,7 @@
               <w:bottom w:type="dxa" w:w="70"/>
               <w:right w:type="dxa" w:w="110"/>
             </w:tcMar>
-            <w:vAlign w:val="center"/>
+            <w:vAlign w:val="top"/>
           </w:tcPr>
           <w:p>
             <w:pPr>
@@ -3900,7 +3900,7 @@
               <w:bottom w:type="dxa" w:w="70"/>
               <w:right w:type="dxa" w:w="110"/>
             </w:tcMar>
-            <w:vAlign w:val="center"/>
+            <w:vAlign w:val="top"/>
           </w:tcPr>
           <w:p>
             <w:pPr>
@@ -3932,7 +3932,7 @@
               <w:bottom w:type="dxa" w:w="70"/>
               <w:right w:type="dxa" w:w="110"/>
             </w:tcMar>
-            <w:vAlign w:val="center"/>
+            <w:vAlign w:val="top"/>
           </w:tcPr>
           <w:p>
             <w:pPr>
@@ -3960,7 +3960,7 @@
               <w:bottom w:type="dxa" w:w="70"/>
               <w:right w:type="dxa" w:w="110"/>
             </w:tcMar>
-            <w:vAlign w:val="center"/>
+            <w:vAlign w:val="top"/>
           </w:tcPr>
           <w:p>
             <w:pPr>
@@ -4034,7 +4034,7 @@
               <w:bottom w:type="dxa" w:w="70"/>
               <w:right w:type="dxa" w:w="110"/>
             </w:tcMar>
-            <w:vAlign w:val="center"/>
+            <w:vAlign w:val="top"/>
           </w:tcPr>
           <w:p>
             <w:pPr>
@@ -4062,7 +4062,7 @@
               <w:bottom w:type="dxa" w:w="70"/>
               <w:right w:type="dxa" w:w="110"/>
             </w:tcMar>
-            <w:vAlign w:val="center"/>
+            <w:vAlign w:val="top"/>
           </w:tcPr>
           <w:p>
             <w:pPr>

</xml_diff>

<commit_message>
Add configurable working days to internship offer letter
Interns typically work Tuesday-Saturday with Sunday and Monday off, so
add two dropdowns to pick the working-day range and fill it into the
Training hours row and the Clause 5 off-days reference.

Co-Authored-By: Claude Sonnet 5 <noreply@anthropic.com>
</commit_message>
<xml_diff>
--- a/offerletter/internship/sloud-internship-letter-template.docx
+++ b/offerletter/internship/sloud-internship-letter-template.docx
@@ -726,7 +726,7 @@
                 <w:sz w:val="21"/>
                 <w:szCs w:val="21"/>
               </w:rPr>
-              <w:t xml:space="preserve">Monday to Friday, up to 6 hours a day and not more than [30] hours a week, as agreed with your mentor (Clause 5)</w:t>
+              <w:t xml:space="preserve">[Working Days], up to 6 hours a day and not more than [30] hours a week, as agreed with your mentor (Clause 5)</w:t>
             </w:r>
           </w:p>
         </w:tc>
@@ -1409,7 +1409,7 @@
           <w:sz w:val="21"/>
           <w:szCs w:val="21"/>
         </w:rPr>
-        <w:t xml:space="preserve">Your training hours are set out in Clause 1. Hours will include reasonable breaks, and you will not be asked to train on Sundays or public holidays unless you agree for a specific event.</w:t>
+        <w:t xml:space="preserve">Your training hours are set out in Clause 1. Hours will include reasonable breaks, and you will not be asked to train on [Off Days] or public holidays unless you agree for a specific event.</w:t>
       </w:r>
     </w:p>
     <w:p>

</xml_diff>